<commit_message>
Backlog: the dictionary as the spine, and the THL catalog
Adam's two additions. Every batch of alignment data should flow outward
into the Learn tab, into drills and trainer and anywhere else it can
serve, rather than only into the export, with the aim that this becomes
the most authoritative Geshe Michael Roach dictionary there is. The
constraint that makes it safe is written down beside it: the tier
travels with the data at every hop, so a layer entry never arrives
anywhere wearing the binding colour.

And the THL Kangyur and Tengyur catalog, folded in only where it
verifiably accords with our own data, with the site's licence and a
match gate that refuses rather than guesses as prerequisites.

Also here: the Sanskrit capture mode for the digest driver, on the
opening verse of Nagarjuna's Root Verses and on two mantras, and the
card badge now reading GMR.

Co-Authored-By: Claude Opus 5 <noreply@anthropic.com>
</commit_message>
<xml_diff>
--- a/docs/digests/2026-09-10.draft.docx
+++ b/docs/digests/2026-09-10.draft.docx
@@ -2,7 +2,7 @@
 <file path=word/document.xml><?xml version="1.0" encoding="utf-8"?>
 <w:document xmlns:w="http://schemas.openxmlformats.org/wordprocessingml/2006/main" xmlns:m="http://schemas.openxmlformats.org/officeDocument/2006/math" xmlns:r="http://schemas.openxmlformats.org/officeDocument/2006/relationships" xmlns:o="urn:schemas-microsoft-com:office:office" xmlns:v="urn:schemas-microsoft-com:vml" xmlns:w10="urn:schemas-microsoft-com:office:word" xmlns:a="http://schemas.openxmlformats.org/drawingml/2006/main" xmlns:pic="http://schemas.openxmlformats.org/drawingml/2006/picture" xmlns:wp="http://schemas.openxmlformats.org/drawingml/2006/wordprocessingDrawing">
   <w:body>
-    <w:bookmarkStart w:id="28" w:name="X60918bd5e7b3b002f4aa38f4ce0b297d3241d58"/>
+    <w:bookmarkStart w:id="35" w:name="X60918bd5e7b3b002f4aa38f4ce0b297d3241d58"/>
     <w:p>
       <w:pPr>
         <w:pStyle w:val="Heading1"/>
@@ -291,7 +291,7 @@
       </w:r>
     </w:p>
     <w:bookmarkEnd w:id="18"/>
-    <w:bookmarkStart w:id="22" w:name="the-sanskrit-workbench"/>
+    <w:bookmarkStart w:id="25" w:name="the-sanskrit-workbench"/>
     <w:p>
       <w:pPr>
         <w:pStyle w:val="Heading2"/>
@@ -345,31 +345,7 @@
         <w:pStyle w:val="BodyText"/>
       </w:pPr>
       <w:r>
-        <w:t xml:space="preserve">Pasted documents are not all Sanskrit, so rules, headings and bracketed labels are carried through untouched — on four objective tests, not on a guess about language: a line with no letters at all, a line wholly inside brackets, a line whose words are all capitals, and a line the engine itself refuses. My own test document is now the test, with a control asserting the heading is not itself run through the converter.</w:t>
-      </w:r>
-    </w:p>
-    <w:p>
-      <w:pPr>
-        <w:pStyle w:val="BodyText"/>
-      </w:pPr>
-      <w:r>
-        <w:t xml:space="preserve">One limit is stated rather than hidden. Reading a passage back</w:t>
-      </w:r>
-      <w:r>
-        <w:t xml:space="preserve"> </w:t>
-      </w:r>
-      <w:r>
-        <w:rPr>
-          <w:i/>
-          <w:iCs/>
-        </w:rPr>
-        <w:t xml:space="preserve">from</w:t>
-      </w:r>
-      <w:r>
-        <w:t xml:space="preserve"> </w:t>
-      </w:r>
-      <w:r>
-        <w:t xml:space="preserve">Tibetanized ACIP gives the right letters run together, because that notation separates syllables and not words, so word boundaries cannot be recovered. The pane says so.</w:t>
+        <w:t xml:space="preserve">Here is the first verse of Nagarjuna’s Root Verses on the Middle Way going into Devanagari.</w:t>
       </w:r>
     </w:p>
     <w:p>
@@ -379,14 +355,14 @@
       <w:r>
         <w:drawing>
           <wp:inline>
-            <wp:extent cx="5334000" cy="2978149"/>
+            <wp:extent cx="5334000" cy="3276600"/>
             <wp:effectExtent b="0" l="0" r="0" t="0"/>
-            <wp:docPr descr="The Sanskrit workbench: a passage, and a choice of notations." title="" id="20" name="Picture"/>
+            <wp:docPr descr="The first verse of Nagarjuna’s Root Verses on the Middle Way, IAST into Devanagari. The bracketed label is carried through untouched." title="" id="20" name="Picture"/>
             <a:graphic>
               <a:graphicData uri="http://schemas.openxmlformats.org/drawingml/2006/picture">
                 <pic:pic>
                   <pic:nvPicPr>
-                    <pic:cNvPr descr="img/2026-09-10/13-sanskrit.png" id="21" name="Picture"/>
+                    <pic:cNvPr descr="img/2026-09-10/sanskrit-devanagari.png" id="21" name="Picture"/>
                     <pic:cNvPicPr>
                       <a:picLocks noChangeArrowheads="1" noChangeAspect="1"/>
                     </pic:cNvPicPr>
@@ -400,7 +376,7 @@
                   <pic:spPr bwMode="auto">
                     <a:xfrm>
                       <a:off x="0" y="0"/>
-                      <a:ext cx="5334000" cy="2978149"/>
+                      <a:ext cx="5334000" cy="3276600"/>
                     </a:xfrm>
                     <a:prstGeom prst="rect">
                       <a:avLst/>
@@ -424,17 +400,88 @@
         <w:pStyle w:val="ImageCaption"/>
       </w:pPr>
       <w:r>
-        <w:t xml:space="preserve">The Sanskrit workbench: a passage, and a choice of notations.</w:t>
-      </w:r>
-    </w:p>
-    <w:bookmarkEnd w:id="22"/>
-    <w:bookmarkStart w:id="23" w:name="Xcc57dc22c72d9cc7b381729be0cc384a43969f1"/>
+        <w:t xml:space="preserve">The first verse of Nagarjuna’s Root Verses on the Middle Way, IAST into Devanagari. The bracketed label is carried through untouched.</w:t>
+      </w:r>
+    </w:p>
+    <w:p>
+      <w:pPr>
+        <w:pStyle w:val="BodyText"/>
+      </w:pPr>
+      <w:r>
+        <w:t xml:space="preserve">Pasted documents are not all Sanskrit, so rules, headings and bracketed labels are carried through untouched — on four objective tests, not on a guess about language: a line with no letters at all, a line wholly inside brackets, a line whose words are all capitals, and a line the engine itself refuses. My own test document is now the test, with a control asserting the heading is not itself run through the converter.</w:t>
+      </w:r>
+    </w:p>
+    <w:p>
+      <w:pPr>
+        <w:pStyle w:val="BodyText"/>
+      </w:pPr>
+      <w:r>
+        <w:t xml:space="preserve">I also asked for everything at once, and that is now a mode of its own.</w:t>
+      </w:r>
+    </w:p>
+    <w:p>
+      <w:pPr>
+        <w:pStyle w:val="CaptionedFigure"/>
+      </w:pPr>
+      <w:r>
+        <w:drawing>
+          <wp:inline>
+            <wp:extent cx="5334000" cy="3276600"/>
+            <wp:effectExtent b="0" l="0" r="0" t="0"/>
+            <wp:docPr descr="The same verse in every notation at once: Devanagari, Tibetanized ACIP, Tibetan script, IPA, both ACIP input styles, and the simplified pronunciation." title="" id="23" name="Picture"/>
+            <a:graphic>
+              <a:graphicData uri="http://schemas.openxmlformats.org/drawingml/2006/picture">
+                <pic:pic>
+                  <pic:nvPicPr>
+                    <pic:cNvPr descr="img/2026-09-10/sanskrit-all-notations.png" id="24" name="Picture"/>
+                    <pic:cNvPicPr>
+                      <a:picLocks noChangeArrowheads="1" noChangeAspect="1"/>
+                    </pic:cNvPicPr>
+                  </pic:nvPicPr>
+                  <pic:blipFill>
+                    <a:blip r:embed="rId22"/>
+                    <a:stretch>
+                      <a:fillRect/>
+                    </a:stretch>
+                  </pic:blipFill>
+                  <pic:spPr bwMode="auto">
+                    <a:xfrm>
+                      <a:off x="0" y="0"/>
+                      <a:ext cx="5334000" cy="3276600"/>
+                    </a:xfrm>
+                    <a:prstGeom prst="rect">
+                      <a:avLst/>
+                    </a:prstGeom>
+                    <a:noFill/>
+                    <a:ln w="9525">
+                      <a:noFill/>
+                      <a:headEnd/>
+                      <a:tailEnd/>
+                    </a:ln>
+                  </pic:spPr>
+                </pic:pic>
+              </a:graphicData>
+            </a:graphic>
+          </wp:inline>
+        </w:drawing>
+      </w:r>
+    </w:p>
+    <w:p>
+      <w:pPr>
+        <w:pStyle w:val="ImageCaption"/>
+      </w:pPr>
+      <w:r>
+        <w:t xml:space="preserve">The same verse in every notation at once: Devanagari, Tibetanized ACIP, Tibetan script, IPA, both ACIP input styles, and the simplified pronunciation.</w:t>
+      </w:r>
+    </w:p>
+    <w:bookmarkEnd w:id="25"/>
+    <w:bookmarkStart w:id="29" w:name="X98e4cde4961596768f614659dfe0e651a447ea3"/>
     <w:p>
       <w:pPr>
         <w:pStyle w:val="Heading2"/>
       </w:pPr>
       <w:r>
-        <w:t xml:space="preserve">The Geshe Michael Roach Dictionary, as a spreadsheet</w:t>
+        <w:t xml:space="preserve">Mantras, read back from the Tibetan letters they are written in</w:t>
       </w:r>
     </w:p>
     <w:p>
@@ -442,7 +489,7 @@
         <w:pStyle w:val="FirstParagraph"/>
       </w:pPr>
       <w:r>
-        <w:t xml:space="preserve">The dictionary drawn from the alignment of Geshe Michael Roach’s courses now exports as CSV every time it is rebuilt, from the same assembled entries the web page renders, so the file and the page cannot disagree about what the dictionary says.</w:t>
+        <w:t xml:space="preserve">This is the part I am most pleased with today, and it came from a single observation: the mantras in the more esoteric texts are not Tibetan at all. They are Sanskrit, written in Tibetan letters. So the tool should take that script, or the Tibetanized ACIP of it, and give back an accurate phonetic line for reciting.</w:t>
       </w:r>
     </w:p>
     <w:p>
@@ -450,7 +497,7 @@
         <w:pStyle w:val="BodyText"/>
       </w:pPr>
       <w:r>
-        <w:t xml:space="preserve">Four files, each answering a different question.</w:t>
+        <w:t xml:space="preserve">That path existed only halfway, and every step of it was broken. Three real faults, all found on actual mantras:</w:t>
       </w:r>
     </w:p>
     <w:p>
@@ -462,6 +509,152 @@
         </w:numPr>
       </w:pPr>
       <w:r>
+        <w:t xml:space="preserve">The stack marker and the crescent mark of our Tibetan transliteration reached the Sanskrit intact, so the mani mantra met a converter that rightly refused them and came back with no pronunciation at all.</w:t>
+      </w:r>
+    </w:p>
+    <w:p>
+      <w:pPr>
+        <w:pStyle w:val="Compact"/>
+        <w:numPr>
+          <w:ilvl w:val="0"/>
+          <w:numId w:val="1001"/>
+        </w:numPr>
+      </w:pPr>
+      <w:r>
+        <w:t xml:space="preserve">The syllable spacing was being thrown away. For a single term that is right, because these notations separate syllables and not words. For a mantra it is exactly wrong: a mantra is recited syllable by syllable, and the spacing is the only guide to where they fall.</w:t>
+      </w:r>
+    </w:p>
+    <w:p>
+      <w:pPr>
+        <w:pStyle w:val="Compact"/>
+        <w:numPr>
+          <w:ilvl w:val="0"/>
+          <w:numId w:val="1001"/>
+        </w:numPr>
+      </w:pPr>
+      <w:r>
+        <w:t xml:space="preserve">Tibetan script was not an input option at all.</w:t>
+      </w:r>
+    </w:p>
+    <w:p>
+      <w:pPr>
+        <w:pStyle w:val="FirstParagraph"/>
+      </w:pPr>
+      <w:r>
+        <w:t xml:space="preserve">All three are fixed, in the reference engine and its working port together. The mani mantra now reads back as</w:t>
+      </w:r>
+      <w:r>
+        <w:t xml:space="preserve"> </w:t>
+      </w:r>
+      <w:r>
+        <w:rPr>
+          <w:b/>
+          <w:bCs/>
+        </w:rPr>
+        <w:t xml:space="preserve">oːm mɐ ɳɪ pɐdmeː ɦuːm</w:t>
+      </w:r>
+      <w:r>
+        <w:t xml:space="preserve">, syllable by syllable, and it is now one of our tests, with a control asserting that no stack or crescent mark ever reaches the reader.</w:t>
+      </w:r>
+    </w:p>
+    <w:p>
+      <w:pPr>
+        <w:pStyle w:val="CaptionedFigure"/>
+      </w:pPr>
+      <w:r>
+        <w:drawing>
+          <wp:inline>
+            <wp:extent cx="5334000" cy="3276600"/>
+            <wp:effectExtent b="0" l="0" r="0" t="0"/>
+            <wp:docPr descr="Two mantras in Tibetan script, read back in every notation. The pronunciation line names the authority it follows, and the simplified line is labelled provisional." title="" id="27" name="Picture"/>
+            <a:graphic>
+              <a:graphicData uri="http://schemas.openxmlformats.org/drawingml/2006/picture">
+                <pic:pic>
+                  <pic:nvPicPr>
+                    <pic:cNvPr descr="img/2026-09-10/sanskrit-mantra.png" id="28" name="Picture"/>
+                    <pic:cNvPicPr>
+                      <a:picLocks noChangeArrowheads="1" noChangeAspect="1"/>
+                    </pic:cNvPicPr>
+                  </pic:nvPicPr>
+                  <pic:blipFill>
+                    <a:blip r:embed="rId26"/>
+                    <a:stretch>
+                      <a:fillRect/>
+                    </a:stretch>
+                  </pic:blipFill>
+                  <pic:spPr bwMode="auto">
+                    <a:xfrm>
+                      <a:off x="0" y="0"/>
+                      <a:ext cx="5334000" cy="3276600"/>
+                    </a:xfrm>
+                    <a:prstGeom prst="rect">
+                      <a:avLst/>
+                    </a:prstGeom>
+                    <a:noFill/>
+                    <a:ln w="9525">
+                      <a:noFill/>
+                      <a:headEnd/>
+                      <a:tailEnd/>
+                    </a:ln>
+                  </pic:spPr>
+                </pic:pic>
+              </a:graphicData>
+            </a:graphic>
+          </wp:inline>
+        </w:drawing>
+      </w:r>
+    </w:p>
+    <w:p>
+      <w:pPr>
+        <w:pStyle w:val="ImageCaption"/>
+      </w:pPr>
+      <w:r>
+        <w:t xml:space="preserve">Two mantras in Tibetan script, read back in every notation. The pronunciation line names the authority it follows, and the simplified line is labelled provisional.</w:t>
+      </w:r>
+    </w:p>
+    <w:p>
+      <w:pPr>
+        <w:pStyle w:val="BodyText"/>
+      </w:pPr>
+      <w:r>
+        <w:t xml:space="preserve">On pronunciation I want to be exact about what we are standing on. The IPA line follows the standard Classical Sanskrit mapping together with FPMT Translation Services’ guide to Sanskrit transliteration and pronunciation of November 2020, with the rules for the nasal and the final breath applied in context. That line is trustworthy. The simplified line beneath it is not yet: it is an eighteen-rule table that strips the diacritical marks, which gives a serviceable plain-letter spelling and is not a pronunciation guide. It is labelled PROVISIONAL in the interface for exactly that reason. Building a trustworthy simplified respelling is a real piece of work and I would rather do it properly than quietly.</w:t>
+      </w:r>
+    </w:p>
+    <w:bookmarkEnd w:id="29"/>
+    <w:bookmarkStart w:id="30" w:name="Xcc57dc22c72d9cc7b381729be0cc384a43969f1"/>
+    <w:p>
+      <w:pPr>
+        <w:pStyle w:val="Heading2"/>
+      </w:pPr>
+      <w:r>
+        <w:t xml:space="preserve">The Geshe Michael Roach Dictionary, as a spreadsheet</w:t>
+      </w:r>
+    </w:p>
+    <w:p>
+      <w:pPr>
+        <w:pStyle w:val="FirstParagraph"/>
+      </w:pPr>
+      <w:r>
+        <w:t xml:space="preserve">The dictionary drawn from the alignment of Geshe Michael Roach’s courses now exports as CSV every time it is rebuilt, from the same assembled entries the web page renders, so the file and the page cannot disagree about what the dictionary says.</w:t>
+      </w:r>
+    </w:p>
+    <w:p>
+      <w:pPr>
+        <w:pStyle w:val="BodyText"/>
+      </w:pPr>
+      <w:r>
+        <w:t xml:space="preserve">Four files, each answering a different question.</w:t>
+      </w:r>
+    </w:p>
+    <w:p>
+      <w:pPr>
+        <w:pStyle w:val="Compact"/>
+        <w:numPr>
+          <w:ilvl w:val="0"/>
+          <w:numId w:val="1002"/>
+        </w:numPr>
+      </w:pPr>
+      <w:r>
         <w:rPr>
           <w:b/>
           <w:bCs/>
@@ -480,7 +673,7 @@
         <w:pStyle w:val="Compact"/>
         <w:numPr>
           <w:ilvl w:val="0"/>
-          <w:numId w:val="1001"/>
+          <w:numId w:val="1002"/>
         </w:numPr>
       </w:pPr>
       <w:r>
@@ -494,7 +687,7 @@
         <w:t xml:space="preserve"> </w:t>
       </w:r>
       <w:r>
-        <w:t xml:space="preserve">Whether Geshe Michael has rendered a given word before, and as what. That is the question an editor actually asks, and the web page cannot answer it.</w:t>
+        <w:t xml:space="preserve">Whether Geshe Michael Roach has rendered a given word before, and as what. That is the question an editor actually asks, and the web page cannot answer it.</w:t>
       </w:r>
     </w:p>
     <w:p>
@@ -502,7 +695,7 @@
         <w:pStyle w:val="Compact"/>
         <w:numPr>
           <w:ilvl w:val="0"/>
-          <w:numId w:val="1001"/>
+          <w:numId w:val="1002"/>
         </w:numPr>
       </w:pPr>
       <w:r>
@@ -524,7 +717,7 @@
         <w:pStyle w:val="Compact"/>
         <w:numPr>
           <w:ilvl w:val="0"/>
-          <w:numId w:val="1001"/>
+          <w:numId w:val="1002"/>
         </w:numPr>
       </w:pPr>
       <w:r>
@@ -549,8 +742,16 @@
         <w:t xml:space="preserve">Two findings came out of building it. The ACIP column has been empty for every entry of the published page, because the index is stored ACIP-to-wylie and was being read the other way round. And the layer holds about fifteen headwords that are English course front matter rather than Tibetan — harmless as text, and fabrication the moment a Tibetan script column is computed from them. So the two computed columns are named for what they are, every row carries a note saying what produced them, and a further column says whether the layer holds that headword at all.</w:t>
       </w:r>
     </w:p>
-    <w:bookmarkEnd w:id="23"/>
-    <w:bookmarkStart w:id="24" w:name="decisions-i-made-along-the-way"/>
+    <w:p>
+      <w:pPr>
+        <w:pStyle w:val="BodyText"/>
+      </w:pPr>
+      <w:r>
+        <w:t xml:space="preserve">It is ready for Joel and waiting in my drafts.</w:t>
+      </w:r>
+    </w:p>
+    <w:bookmarkEnd w:id="30"/>
+    <w:bookmarkStart w:id="31" w:name="decisions-i-made-along-the-way"/>
     <w:p>
       <w:pPr>
         <w:pStyle w:val="Heading2"/>
@@ -604,6 +805,24 @@
           <w:b/>
           <w:bCs/>
         </w:rPr>
+        <w:t xml:space="preserve">His title goes with his name.</w:t>
+      </w:r>
+      <w:r>
+        <w:t xml:space="preserve"> </w:t>
+      </w:r>
+      <w:r>
+        <w:t xml:space="preserve">Everywhere — prose, the interface, email, document titles and file names. I also retired the internal abbreviation we had been using for him, which stands for a form of address only his close students use and is not how he should be referred to publicly. Sixty-seven places in the application now say his name or a plain three-letter label instead. What I deliberately did not rename are the column names inside the data release itself; those belong to the data project, and changing them here would break reading it.</w:t>
+      </w:r>
+    </w:p>
+    <w:p>
+      <w:pPr>
+        <w:pStyle w:val="BodyText"/>
+      </w:pPr>
+      <w:r>
+        <w:rPr>
+          <w:b/>
+          <w:bCs/>
+        </w:rPr>
         <w:t xml:space="preserve">The ribbon’s width promise held.</w:t>
       </w:r>
       <w:r>
@@ -613,8 +832,8 @@
         <w:t xml:space="preserve">The idiom bank wanted a ribbon button and would have pushed the ribbon past the width we promised ourselves it would never exceed. It went to a right-click and a menu instead.</w:t>
       </w:r>
     </w:p>
-    <w:bookmarkEnd w:id="24"/>
-    <w:bookmarkStart w:id="25" w:name="numbers"/>
+    <w:bookmarkEnd w:id="31"/>
+    <w:bookmarkStart w:id="32" w:name="numbers"/>
     <w:p>
       <w:pPr>
         <w:pStyle w:val="Heading2"/>
@@ -825,9 +1044,33 @@
           </w:p>
         </w:tc>
       </w:tr>
+      <w:tr>
+        <w:tc>
+          <w:tcPr/>
+          <w:p>
+            <w:pPr>
+              <w:pStyle w:val="Compact"/>
+            </w:pPr>
+            <w:r>
+              <w:t xml:space="preserve">Places his title was restored</w:t>
+            </w:r>
+          </w:p>
+        </w:tc>
+        <w:tc>
+          <w:tcPr/>
+          <w:p>
+            <w:pPr>
+              <w:pStyle w:val="Compact"/>
+            </w:pPr>
+            <w:r>
+              <w:t xml:space="preserve">67</w:t>
+            </w:r>
+          </w:p>
+        </w:tc>
+      </w:tr>
     </w:tbl>
-    <w:bookmarkEnd w:id="25"/>
-    <w:bookmarkStart w:id="26" w:name="open-questions-for-leadership"/>
+    <w:bookmarkEnd w:id="32"/>
+    <w:bookmarkStart w:id="33" w:name="open-questions-for-leadership"/>
     <w:p>
       <w:pPr>
         <w:pStyle w:val="Heading2"/>
@@ -844,8 +1087,8 @@
         <w:t xml:space="preserve">The dictionary export is ready for Joel and is waiting in my drafts. Everything in it is TENTATIVE: Geshe Michael Roach’s own English, matched to the Tibetan by machine and never composed, and none of it enters his binding dictionary until he rules on it. What I would like to know is the shape he wants for ruling on it — a review queue with a column for his decisions is easy to produce, and would turn the export into something he can work through rather than only read.</w:t>
       </w:r>
     </w:p>
-    <w:bookmarkEnd w:id="26"/>
-    <w:bookmarkStart w:id="27" w:name="next"/>
+    <w:bookmarkEnd w:id="33"/>
+    <w:bookmarkStart w:id="34" w:name="next"/>
     <w:p>
       <w:pPr>
         <w:pStyle w:val="Heading2"/>
@@ -859,11 +1102,11 @@
         <w:pStyle w:val="FirstParagraph"/>
       </w:pPr>
       <w:r>
-        <w:t xml:space="preserve">Press and install this afternoon’s work. Then the theme system, which is designed and waiting on my rulings: eight coordinated colour schemes computed from a small set of seeds, with the honesty colours frozen in meaning across every one of them, so a theme can say what surface you are reading on and is structurally unable to say whose English you are reading.</w:t>
-      </w:r>
-    </w:p>
-    <w:bookmarkEnd w:id="27"/>
-    <w:bookmarkEnd w:id="28"/>
+        <w:t xml:space="preserve">Pressed and installed twice this afternoon; the latest build is on my desktop and the Sanskrit work is in it. Then the theme system, which is designed and waiting on my rulings: eight coordinated colour schemes computed from a small set of seeds, with the honesty colours frozen in meaning across every one of them, so a theme can say what surface you are reading on and is structurally unable to say whose English you are reading.</w:t>
+      </w:r>
+    </w:p>
+    <w:bookmarkEnd w:id="34"/>
+    <w:bookmarkEnd w:id="35"/>
     <w:sectPr>
       <w:footnotePr>
         <w:numRestart w:val="eachSect"/>
@@ -1081,6 +1324,9 @@
     <w:abstractNumId w:val="990"/>
   </w:num>
   <w:num w:numId="1001">
+    <w:abstractNumId w:val="991"/>
+  </w:num>
+  <w:num w:numId="1002">
     <w:abstractNumId w:val="991"/>
   </w:num>
 </w:numbering>

</xml_diff>

<commit_message>
The digest as it stands tonight
Covers everything since the 09:33 digest went out: the hover
descriptions, the appearance fix, the night-mode shading, the Draft
workspace, the dictionary CSV export, Geshe Michael Roach's title
restored throughout, the Sanskrit workbench and the mantra pronunciation,
the ALL pronunciation standard, the Drills work, and the iPhone app.

Written in Adam's voice with the numbers he can defend, centred headings
and figures per his standing order, and honest about the fifth of drills
that still carry a flagged syllable.

Co-Authored-By: Claude Opus 5 <noreply@anthropic.com>
</commit_message>
<xml_diff>
--- a/docs/digests/2026-09-10.draft.docx
+++ b/docs/digests/2026-09-10.draft.docx
@@ -2,7 +2,7 @@
 <file path=word/document.xml><?xml version="1.0" encoding="utf-8"?>
 <w:document xmlns:w="http://schemas.openxmlformats.org/wordprocessingml/2006/main" xmlns:m="http://schemas.openxmlformats.org/officeDocument/2006/math" xmlns:r="http://schemas.openxmlformats.org/officeDocument/2006/relationships" xmlns:o="urn:schemas-microsoft-com:office:office" xmlns:v="urn:schemas-microsoft-com:vml" xmlns:w10="urn:schemas-microsoft-com:office:word" xmlns:a="http://schemas.openxmlformats.org/drawingml/2006/main" xmlns:pic="http://schemas.openxmlformats.org/drawingml/2006/picture" xmlns:wp="http://schemas.openxmlformats.org/drawingml/2006/wordprocessingDrawing">
   <w:body>
-    <w:bookmarkStart w:id="35" w:name="X60918bd5e7b3b002f4aa38f4ce0b297d3241d58"/>
+    <w:bookmarkStart w:id="41" w:name="X60918bd5e7b3b002f4aa38f4ce0b297d3241d58"/>
     <w:p>
       <w:pPr>
         <w:pStyle w:val="Heading1"/>
@@ -1088,12 +1088,559 @@
       </w:r>
     </w:p>
     <w:bookmarkEnd w:id="33"/>
-    <w:bookmarkStart w:id="34" w:name="next"/>
+    <w:bookmarkStart w:id="34" w:name="the-learn-tab-and-a-phone"/>
     <w:p>
       <w:pPr>
         <w:pStyle w:val="Heading2"/>
       </w:pPr>
       <w:r>
+        <w:t xml:space="preserve">The Learn tab, and a phone</w:t>
+      </w:r>
+    </w:p>
+    <w:p>
+      <w:pPr>
+        <w:pStyle w:val="FirstParagraph"/>
+      </w:pPr>
+      <w:r>
+        <w:t xml:space="preserve">The afternoon turned into a long piece of work on the Drills, and then into an</w:t>
+      </w:r>
+      <w:r>
+        <w:t xml:space="preserve"> </w:t>
+      </w:r>
+      <w:r>
+        <w:t xml:space="preserve">iPhone app, because I kept finding the same fault from different angles.</w:t>
+      </w:r>
+    </w:p>
+    <w:p>
+      <w:pPr>
+        <w:pStyle w:val="BodyText"/>
+      </w:pPr>
+      <w:r>
+        <w:t xml:space="preserve">I sent seven screenshots of drills that looked wrong. Three separate faults were</w:t>
+      </w:r>
+      <w:r>
+        <w:t xml:space="preserve"> </w:t>
+      </w:r>
+      <w:r>
+        <w:t xml:space="preserve">behind them, and every one is now measured rather than guessed.</w:t>
+      </w:r>
+    </w:p>
+    <w:p>
+      <w:pPr>
+        <w:pStyle w:val="BodyText"/>
+      </w:pPr>
+      <w:r>
+        <w:rPr>
+          <w:b/>
+          <w:bCs/>
+        </w:rPr>
+        <w:t xml:space="preserve">The English did not match the Tibetan in size.</w:t>
+      </w:r>
+      <w:r>
+        <w:t xml:space="preserve"> </w:t>
+      </w:r>
+      <w:r>
+        <w:t xml:space="preserve">The drill picks one clause</w:t>
+      </w:r>
+      <w:r>
+        <w:t xml:space="preserve"> </w:t>
+      </w:r>
+      <w:r>
+        <w:t xml:space="preserve">but printed my English for the whole segment. Measured over three hundred real</w:t>
+      </w:r>
+      <w:r>
+        <w:t xml:space="preserve"> </w:t>
+      </w:r>
+      <w:r>
+        <w:t xml:space="preserve">drills, the clause shown averaged</w:t>
+      </w:r>
+      <w:r>
+        <w:t xml:space="preserve"> </w:t>
+      </w:r>
+      <w:r>
+        <w:rPr>
+          <w:b/>
+          <w:bCs/>
+        </w:rPr>
+        <w:t xml:space="preserve">27.5%</w:t>
+      </w:r>
+      <w:r>
+        <w:t xml:space="preserve"> </w:t>
+      </w:r>
+      <w:r>
+        <w:t xml:space="preserve">of the segment whose English sat</w:t>
+      </w:r>
+      <w:r>
+        <w:t xml:space="preserve"> </w:t>
+      </w:r>
+      <w:r>
+        <w:t xml:space="preserve">above it — a forty-word paragraph over three syllables. It now shows the whole</w:t>
+      </w:r>
+      <w:r>
+        <w:t xml:space="preserve"> </w:t>
+      </w:r>
+      <w:r>
+        <w:t xml:space="preserve">segment, with the answer blanked where it actually stands.</w:t>
+      </w:r>
+    </w:p>
+    <w:p>
+      <w:pPr>
+        <w:pStyle w:val="BodyText"/>
+      </w:pPr>
+      <w:r>
+        <w:rPr>
+          <w:b/>
+          <w:bCs/>
+        </w:rPr>
+        <w:t xml:space="preserve">Raw source code was leaking into the Tibetan.</w:t>
+      </w:r>
+      <w:r>
+        <w:t xml:space="preserve"> </w:t>
+      </w:r>
+      <w:r>
+        <w:t xml:space="preserve">Options were rendering as</w:t>
+      </w:r>
+      <w:r>
+        <w:t xml:space="preserve"> </w:t>
+      </w:r>
+      <w:r>
+        <w:t xml:space="preserve">“(RNAMS”</w:t>
+      </w:r>
+      <w:r>
+        <w:t xml:space="preserve">,</w:t>
+      </w:r>
+      <w:r>
+        <w:t xml:space="preserve"> </w:t>
+      </w:r>
+      <w:r>
+        <w:t xml:space="preserve">“(GNAS BRTAN)”</w:t>
+      </w:r>
+      <w:r>
+        <w:t xml:space="preserve">,</w:t>
+      </w:r>
+      <w:r>
+        <w:t xml:space="preserve"> </w:t>
+      </w:r>
+      <w:r>
+        <w:t xml:space="preserve">“(ZHES”</w:t>
+      </w:r>
+      <w:r>
+        <w:t xml:space="preserve">. The converter was being handed each word</w:t>
+      </w:r>
+      <w:r>
+        <w:t xml:space="preserve"> </w:t>
+      </w:r>
+      <w:r>
+        <w:t xml:space="preserve">whole and, when it failed, printing the raw code inline as though it were</w:t>
+      </w:r>
+      <w:r>
+        <w:t xml:space="preserve"> </w:t>
+      </w:r>
+      <w:r>
+        <w:t xml:space="preserve">script. It hit 3.3% of drills.</w:t>
+      </w:r>
+    </w:p>
+    <w:p>
+      <w:pPr>
+        <w:pStyle w:val="BodyText"/>
+      </w:pPr>
+      <w:r>
+        <w:rPr>
+          <w:b/>
+          <w:bCs/>
+        </w:rPr>
+        <w:t xml:space="preserve">Title lines were being drilled as if they were sentences,</w:t>
+      </w:r>
+      <w:r>
+        <w:t xml:space="preserve"> </w:t>
+      </w:r>
+      <w:r>
+        <w:t xml:space="preserve">and far more often</w:t>
+      </w:r>
+      <w:r>
+        <w:t xml:space="preserve"> </w:t>
+      </w:r>
+      <w:r>
+        <w:t xml:space="preserve">than chance. This one was the real culprit: the adaptive draw prefers short</w:t>
+      </w:r>
+      <w:r>
+        <w:t xml:space="preserve"> </w:t>
+      </w:r>
+      <w:r>
+        <w:t xml:space="preserve">segments, and the title catalogue is the shortest material we have — ten to</w:t>
+      </w:r>
+      <w:r>
+        <w:t xml:space="preserve"> </w:t>
+      </w:r>
+      <w:r>
+        <w:t xml:space="preserve">fifteen words against a corpus average near thirty-six. Measured:</w:t>
+      </w:r>
+      <w:r>
+        <w:t xml:space="preserve"> </w:t>
+      </w:r>
+      <w:r>
+        <w:rPr>
+          <w:b/>
+          <w:bCs/>
+        </w:rPr>
+        <w:t xml:space="preserve">twenty to</w:t>
+      </w:r>
+      <w:r>
+        <w:rPr>
+          <w:b/>
+          <w:bCs/>
+        </w:rPr>
+        <w:t xml:space="preserve"> </w:t>
+      </w:r>
+      <w:r>
+        <w:rPr>
+          <w:b/>
+          <w:bCs/>
+        </w:rPr>
+        <w:t xml:space="preserve">twenty-five percent of my drills were catalogue entries,</w:t>
+      </w:r>
+      <w:r>
+        <w:t xml:space="preserve"> </w:t>
+      </w:r>
+      <w:r>
+        <w:t xml:space="preserve">and the title course</w:t>
+      </w:r>
+      <w:r>
+        <w:t xml:space="preserve"> </w:t>
+      </w:r>
+      <w:r>
+        <w:t xml:space="preserve">was the single most-drawn of all seventy-five. A quarter of everything I was</w:t>
+      </w:r>
+      <w:r>
+        <w:t xml:space="preserve"> </w:t>
+      </w:r>
+      <w:r>
+        <w:t xml:space="preserve">seeing. All of it now refused at the draw, along with 254 segments that hold</w:t>
+      </w:r>
+      <w:r>
+        <w:t xml:space="preserve"> </w:t>
+      </w:r>
+      <w:r>
+        <w:t xml:space="preserve">English where the Tibetan should be, which had been rendering as convincing</w:t>
+      </w:r>
+      <w:r>
+        <w:t xml:space="preserve"> </w:t>
+      </w:r>
+      <w:r>
+        <w:t xml:space="preserve">nonsense.</w:t>
+      </w:r>
+    </w:p>
+    <w:p>
+      <w:pPr>
+        <w:pStyle w:val="BodyText"/>
+      </w:pPr>
+      <w:r>
+        <w:t xml:space="preserve">I asked for titles to be labelled rather than hidden, and they are — the signal</w:t>
+      </w:r>
+      <w:r>
+        <w:t xml:space="preserve"> </w:t>
+      </w:r>
+      <w:r>
+        <w:t xml:space="preserve">turned out to be structural rather than a guess about the prose.</w:t>
+      </w:r>
+    </w:p>
+    <w:bookmarkEnd w:id="34"/>
+    <w:bookmarkStart w:id="35" w:name="the-one-i-am-most-pleased-to-have-caught"/>
+    <w:p>
+      <w:pPr>
+        <w:pStyle w:val="Heading2"/>
+      </w:pPr>
+      <w:r>
+        <w:t xml:space="preserve">The one I am most pleased to have caught</w:t>
+      </w:r>
+    </w:p>
+    <w:p>
+      <w:pPr>
+        <w:pStyle w:val="FirstParagraph"/>
+      </w:pPr>
+      <w:r>
+        <w:t xml:space="preserve">Late on I noticed an option beginning with an open parenthesis, against a</w:t>
+      </w:r>
+      <w:r>
+        <w:t xml:space="preserve"> </w:t>
+      </w:r>
+      <w:r>
+        <w:t xml:space="preserve">segment ending in a closing one. The punctuation was telling the learner the</w:t>
+      </w:r>
+      <w:r>
+        <w:t xml:space="preserve"> </w:t>
+      </w:r>
+      <w:r>
+        <w:t xml:space="preserve">answer before they read a word of Tibetan. Gone now: zero options begin with a</w:t>
+      </w:r>
+      <w:r>
+        <w:t xml:space="preserve"> </w:t>
+      </w:r>
+      <w:r>
+        <w:t xml:space="preserve">bracket.</w:t>
+      </w:r>
+    </w:p>
+    <w:p>
+      <w:pPr>
+        <w:pStyle w:val="BodyText"/>
+      </w:pPr>
+      <w:r>
+        <w:t xml:space="preserve">And I said the English still often looked too long to be the equivalent. It was,</w:t>
+      </w:r>
+      <w:r>
+        <w:t xml:space="preserve"> </w:t>
+      </w:r>
+      <w:r>
+        <w:t xml:space="preserve">and the reason is exact. My C15 example measures</w:t>
+      </w:r>
+      <w:r>
+        <w:t xml:space="preserve"> </w:t>
+      </w:r>
+      <w:r>
+        <w:rPr>
+          <w:b/>
+          <w:bCs/>
+        </w:rPr>
+        <w:t xml:space="preserve">4.3 English words per Tibetan</w:t>
+      </w:r>
+      <w:r>
+        <w:rPr>
+          <w:b/>
+          <w:bCs/>
+        </w:rPr>
+        <w:t xml:space="preserve"> </w:t>
+      </w:r>
+      <w:r>
+        <w:rPr>
+          <w:b/>
+          <w:bCs/>
+        </w:rPr>
+        <w:t xml:space="preserve">word counting the bracketed material, and 1.4 without — 1.4 being the corpus</w:t>
+      </w:r>
+      <w:r>
+        <w:rPr>
+          <w:b/>
+          <w:bCs/>
+        </w:rPr>
+        <w:t xml:space="preserve"> </w:t>
+      </w:r>
+      <w:r>
+        <w:rPr>
+          <w:b/>
+          <w:bCs/>
+        </w:rPr>
+        <w:t xml:space="preserve">median exactly.</w:t>
+      </w:r>
+      <w:r>
+        <w:t xml:space="preserve"> </w:t>
+      </w:r>
+      <w:r>
+        <w:t xml:space="preserve">The brackets are things I supplied as translator: a</w:t>
+      </w:r>
+      <w:r>
+        <w:t xml:space="preserve"> </w:t>
+      </w:r>
+      <w:r>
+        <w:t xml:space="preserve">restatement of the previous debate move, a gloss, a page number. They have no</w:t>
+      </w:r>
+      <w:r>
+        <w:t xml:space="preserve"> </w:t>
+      </w:r>
+      <w:r>
+        <w:t xml:space="preserve">Tibetan in that segment at all. Three thousand segments carry some. They are now</w:t>
+      </w:r>
+      <w:r>
+        <w:t xml:space="preserve"> </w:t>
+      </w:r>
+      <w:r>
+        <w:t xml:space="preserve">greyed and labelled as supplied, rather than presented as the parallel.</w:t>
+      </w:r>
+    </w:p>
+    <w:bookmarkEnd w:id="35"/>
+    <w:bookmarkStart w:id="39" w:name="on-the-phone"/>
+    <w:p>
+      <w:pPr>
+        <w:pStyle w:val="Heading2"/>
+      </w:pPr>
+      <w:r>
+        <w:t xml:space="preserve">On the phone</w:t>
+      </w:r>
+    </w:p>
+    <w:p>
+      <w:pPr>
+        <w:pStyle w:val="FirstParagraph"/>
+      </w:pPr>
+      <w:r>
+        <w:t xml:space="preserve">The drills and the trainer now run as an iPhone app. The whole core compiled for</w:t>
+      </w:r>
+      <w:r>
+        <w:t xml:space="preserve"> </w:t>
+      </w:r>
+      <w:r>
+        <w:t xml:space="preserve">a real device unchanged — seventy-seven files, no edits — which was the only</w:t>
+      </w:r>
+      <w:r>
+        <w:t xml:space="preserve"> </w:t>
+      </w:r>
+      <w:r>
+        <w:t xml:space="preserve">genuine risk in the estimate. Everything is generated on the Mac, so the phone</w:t>
+      </w:r>
+      <w:r>
+        <w:t xml:space="preserve"> </w:t>
+      </w:r>
+      <w:r>
+        <w:t xml:space="preserve">inherits every refusal above and carries no database at all.</w:t>
+      </w:r>
+    </w:p>
+    <w:p>
+      <w:pPr>
+        <w:pStyle w:val="CaptionedFigure"/>
+      </w:pPr>
+      <w:r>
+        <w:drawing>
+          <wp:inline>
+            <wp:extent cx="5334000" cy="11596805"/>
+            <wp:effectExtent b="0" l="0" r="0" t="0"/>
+            <wp:docPr descr="The Trainer on iPhone: read the passage yourself, then reveal one layer at a time." title="" id="37" name="Picture"/>
+            <a:graphic>
+              <a:graphicData uri="http://schemas.openxmlformats.org/drawingml/2006/picture">
+                <pic:pic>
+                  <pic:nvPicPr>
+                    <pic:cNvPr descr="img/2026-09-10/trainer_mode.png" id="38" name="Picture"/>
+                    <pic:cNvPicPr>
+                      <a:picLocks noChangeArrowheads="1" noChangeAspect="1"/>
+                    </pic:cNvPicPr>
+                  </pic:nvPicPr>
+                  <pic:blipFill>
+                    <a:blip r:embed="rId36"/>
+                    <a:stretch>
+                      <a:fillRect/>
+                    </a:stretch>
+                  </pic:blipFill>
+                  <pic:spPr bwMode="auto">
+                    <a:xfrm>
+                      <a:off x="0" y="0"/>
+                      <a:ext cx="5334000" cy="11596805"/>
+                    </a:xfrm>
+                    <a:prstGeom prst="rect">
+                      <a:avLst/>
+                    </a:prstGeom>
+                    <a:noFill/>
+                    <a:ln w="9525">
+                      <a:noFill/>
+                      <a:headEnd/>
+                      <a:tailEnd/>
+                    </a:ln>
+                  </pic:spPr>
+                </pic:pic>
+              </a:graphicData>
+            </a:graphic>
+          </wp:inline>
+        </w:drawing>
+      </w:r>
+    </w:p>
+    <w:p>
+      <w:pPr>
+        <w:pStyle w:val="ImageCaption"/>
+      </w:pPr>
+      <w:r>
+        <w:t xml:space="preserve">The Trainer on iPhone: read the passage yourself, then reveal one layer at a time.</w:t>
+      </w:r>
+    </w:p>
+    <w:p>
+      <w:pPr>
+        <w:pStyle w:val="BodyText"/>
+      </w:pPr>
+      <w:r>
+        <w:t xml:space="preserve">Seeing it on a small screen immediately exposed something the desktop had been</w:t>
+      </w:r>
+      <w:r>
+        <w:t xml:space="preserve"> </w:t>
+      </w:r>
+      <w:r>
+        <w:t xml:space="preserve">hiding: one segment pairs</w:t>
+      </w:r>
+      <w:r>
+        <w:t xml:space="preserve"> </w:t>
+      </w:r>
+      <w:r>
+        <w:rPr>
+          <w:b/>
+          <w:bCs/>
+        </w:rPr>
+        <w:t xml:space="preserve">5,180 English words with five Tibetan words</w:t>
+      </w:r>
+      <w:r>
+        <w:t xml:space="preserve">. The</w:t>
+      </w:r>
+      <w:r>
+        <w:t xml:space="preserve"> </w:t>
+      </w:r>
+      <w:r>
+        <w:t xml:space="preserve">hint was longer than the lesson. There is now a proportion ceiling, set from the</w:t>
+      </w:r>
+      <w:r>
+        <w:t xml:space="preserve"> </w:t>
+      </w:r>
+      <w:r>
+        <w:t xml:space="preserve">measured distribution rather than by eye.</w:t>
+      </w:r>
+    </w:p>
+    <w:p>
+      <w:pPr>
+        <w:pStyle w:val="BodyText"/>
+      </w:pPr>
+      <w:r>
+        <w:t xml:space="preserve">It is going to</w:t>
+      </w:r>
+      <w:r>
+        <w:t xml:space="preserve"> </w:t>
+      </w:r>
+      <w:r>
+        <w:rPr>
+          <w:b/>
+          <w:bCs/>
+        </w:rPr>
+        <w:t xml:space="preserve">TestFlight</w:t>
+      </w:r>
+      <w:r>
+        <w:t xml:space="preserve"> </w:t>
+      </w:r>
+      <w:r>
+        <w:t xml:space="preserve">rather than the App Store. My decision, on the</w:t>
+      </w:r>
+      <w:r>
+        <w:t xml:space="preserve"> </w:t>
+      </w:r>
+      <w:r>
+        <w:t xml:space="preserve">recommendation that it reaches our team and the Mixed Nuts students this week</w:t>
+      </w:r>
+      <w:r>
+        <w:t xml:space="preserve"> </w:t>
+      </w:r>
+      <w:r>
+        <w:t xml:space="preserve">without putting machine-aligned renderings of Geshe Michael Roach’s work on a</w:t>
+      </w:r>
+      <w:r>
+        <w:t xml:space="preserve"> </w:t>
+      </w:r>
+      <w:r>
+        <w:t xml:space="preserve">public store before he has ruled on them. Same build, same upload, up to ten</w:t>
+      </w:r>
+      <w:r>
+        <w:t xml:space="preserve"> </w:t>
+      </w:r>
+      <w:r>
+        <w:t xml:space="preserve">thousand testers.</w:t>
+      </w:r>
+    </w:p>
+    <w:bookmarkEnd w:id="39"/>
+    <w:bookmarkStart w:id="40" w:name="next"/>
+    <w:p>
+      <w:pPr>
+        <w:pStyle w:val="Heading2"/>
+      </w:pPr>
+      <w:r>
         <w:t xml:space="preserve">Next</w:t>
       </w:r>
     </w:p>
@@ -1105,8 +1652,8 @@
         <w:t xml:space="preserve">Pressed and installed twice this afternoon; the latest build is on my desktop and the Sanskrit work is in it. Then the theme system, which is designed and waiting on my rulings: eight coordinated colour schemes computed from a small set of seeds, with the honesty colours frozen in meaning across every one of them, so a theme can say what surface you are reading on and is structurally unable to say whose English you are reading.</w:t>
       </w:r>
     </w:p>
-    <w:bookmarkEnd w:id="34"/>
-    <w:bookmarkEnd w:id="35"/>
+    <w:bookmarkEnd w:id="40"/>
+    <w:bookmarkEnd w:id="41"/>
     <w:sectPr>
       <w:footnotePr>
         <w:numRestart w:val="eachSect"/>

</xml_diff>